<commit_message>
updated the figures based on the base_ml_model
</commit_message>
<xml_diff>
--- a/report/Beyond_Interoperability_Report.docx
+++ b/report/Beyond_Interoperability_Report.docx
@@ -7124,8 +7124,464 @@
           <w:i w:val="0"/>
           <w:sz w:val="22"/>
         </w:rPr>
-        <w:t>Before conformal calibration means anything, the underlying model has to have actually learned something. FedAvg trains a shared softmax model across Cleveland, Hungary and the V.A. (holding Switzerland out entirely, to test genuine external validation) by having each site take a few local gradient steps and averaging the resulting weights, weighted by site size, every communication round -- no patient-level data ever leaves its hospital.</w:t>
+        <w:t>Before conformal calibration means anything, the underlying model has to have actually learned something. FedAvg trains a shared softmax model across Cleveland, Hungary and the V.A. (holding Switzerland out entirely, to test genuine external validation) by having each site take a few local gradient steps and averaging the resulting weights, weighted by site size, every communication round -- no patient-level data ever leaves its hospital. Table 9.1 documents the exact model and optimization configuration behind every federated result in this report.</w:t>
       </w:r>
+    </w:p>
+    <w:p>
+      <w:pPr>
+        <w:spacing w:after="160"/>
+      </w:pPr>
+      <w:r>
+        <w:rPr>
+          <w:b/>
+          <w:i w:val="0"/>
+          <w:sz w:val="21"/>
+        </w:rPr>
+        <w:t>Table 9.1 -- Model architecture and training configuration (disease-severity task)</w:t>
+      </w:r>
+    </w:p>
+    <w:tbl>
+      <w:tblPr>
+        <w:tblStyle w:val="TableGrid"/>
+        <w:tblW w:type="auto" w:w="0"/>
+        <w:jc w:val="center"/>
+        <w:tblLook w:firstColumn="1" w:firstRow="1" w:lastColumn="0" w:lastRow="0" w:noHBand="0" w:noVBand="1" w:val="04A0"/>
+      </w:tblPr>
+      <w:tblGrid>
+        <w:gridCol w:w="4320"/>
+        <w:gridCol w:w="4320"/>
+      </w:tblGrid>
+      <w:tr>
+        <w:tc>
+          <w:tcPr>
+            <w:tcW w:type="dxa" w:w="4320"/>
+            <w:shd w:fill="2A78D6"/>
+          </w:tcPr>
+          <w:p>
+            <w:r/>
+            <w:r>
+              <w:rPr>
+                <w:b/>
+                <w:color w:val="FFFFFF"/>
+                <w:sz w:val="20"/>
+              </w:rPr>
+              <w:t>Setting</w:t>
+            </w:r>
+          </w:p>
+        </w:tc>
+        <w:tc>
+          <w:tcPr>
+            <w:tcW w:type="dxa" w:w="4320"/>
+            <w:shd w:fill="2A78D6"/>
+          </w:tcPr>
+          <w:p>
+            <w:r/>
+            <w:r>
+              <w:rPr>
+                <w:b/>
+                <w:color w:val="FFFFFF"/>
+                <w:sz w:val="20"/>
+              </w:rPr>
+              <w:t>Value</w:t>
+            </w:r>
+          </w:p>
+        </w:tc>
+      </w:tr>
+      <w:tr>
+        <w:tc>
+          <w:tcPr>
+            <w:tcW w:type="dxa" w:w="4320"/>
+          </w:tcPr>
+          <w:p>
+            <w:r/>
+            <w:r>
+              <w:rPr>
+                <w:sz w:val="19"/>
+              </w:rPr>
+              <w:t>Model class</w:t>
+            </w:r>
+          </w:p>
+        </w:tc>
+        <w:tc>
+          <w:tcPr>
+            <w:tcW w:type="dxa" w:w="4320"/>
+          </w:tcPr>
+          <w:p>
+            <w:r/>
+            <w:r>
+              <w:rPr>
+                <w:sz w:val="19"/>
+              </w:rPr>
+              <w:t>SoftmaxModel (fedconformal.federated) -- multinomial logistic regression: a single linear layer, logits = X W + b, softmax output. No hidden layers.</w:t>
+            </w:r>
+          </w:p>
+        </w:tc>
+      </w:tr>
+      <w:tr>
+        <w:tc>
+          <w:tcPr>
+            <w:tcW w:type="dxa" w:w="4320"/>
+          </w:tcPr>
+          <w:p>
+            <w:r/>
+            <w:r>
+              <w:rPr>
+                <w:sz w:val="19"/>
+              </w:rPr>
+              <w:t>Trainable parameters</w:t>
+            </w:r>
+          </w:p>
+        </w:tc>
+        <w:tc>
+          <w:tcPr>
+            <w:tcW w:type="dxa" w:w="4320"/>
+          </w:tcPr>
+          <w:p>
+            <w:r/>
+            <w:r>
+              <w:rPr>
+                <w:sz w:val="19"/>
+              </w:rPr>
+              <w:t>Weight matrix W: 13 features x 5 classes = 65 weights, plus bias vector b: 5 -- 70 parameters total</w:t>
+            </w:r>
+          </w:p>
+        </w:tc>
+      </w:tr>
+      <w:tr>
+        <w:tc>
+          <w:tcPr>
+            <w:tcW w:type="dxa" w:w="4320"/>
+          </w:tcPr>
+          <w:p>
+            <w:r/>
+            <w:r>
+              <w:rPr>
+                <w:sz w:val="19"/>
+              </w:rPr>
+              <w:t>Loss function</w:t>
+            </w:r>
+          </w:p>
+        </w:tc>
+        <w:tc>
+          <w:tcPr>
+            <w:tcW w:type="dxa" w:w="4320"/>
+          </w:tcPr>
+          <w:p>
+            <w:r/>
+            <w:r>
+              <w:rPr>
+                <w:sz w:val="19"/>
+              </w:rPr>
+              <w:t>Multiclass cross-entropy (negative log-likelihood): -mean( log( P[i, y_i] ) ) over patients i, softmax probability P</w:t>
+            </w:r>
+          </w:p>
+        </w:tc>
+      </w:tr>
+      <w:tr>
+        <w:tc>
+          <w:tcPr>
+            <w:tcW w:type="dxa" w:w="4320"/>
+          </w:tcPr>
+          <w:p>
+            <w:r/>
+            <w:r>
+              <w:rPr>
+                <w:sz w:val="19"/>
+              </w:rPr>
+              <w:t>Optimizer</w:t>
+            </w:r>
+          </w:p>
+        </w:tc>
+        <w:tc>
+          <w:tcPr>
+            <w:tcW w:type="dxa" w:w="4320"/>
+          </w:tcPr>
+          <w:p>
+            <w:r/>
+            <w:r>
+              <w:rPr>
+                <w:sz w:val="19"/>
+              </w:rPr>
+              <w:t>Full-batch gradient descent, analytic gradient (no autograd, no momentum, no Adam) -- theta &lt;- theta - lr x gradient every local epoch</w:t>
+            </w:r>
+          </w:p>
+        </w:tc>
+      </w:tr>
+      <w:tr>
+        <w:tc>
+          <w:tcPr>
+            <w:tcW w:type="dxa" w:w="4320"/>
+          </w:tcPr>
+          <w:p>
+            <w:r/>
+            <w:r>
+              <w:rPr>
+                <w:sz w:val="19"/>
+              </w:rPr>
+              <w:t>Learning rate</w:t>
+            </w:r>
+          </w:p>
+        </w:tc>
+        <w:tc>
+          <w:tcPr>
+            <w:tcW w:type="dxa" w:w="4320"/>
+          </w:tcPr>
+          <w:p>
+            <w:r/>
+            <w:r>
+              <w:rPr>
+                <w:sz w:val="19"/>
+              </w:rPr>
+              <w:t>0.3 (fixed, no schedule/decay)</w:t>
+            </w:r>
+          </w:p>
+        </w:tc>
+      </w:tr>
+      <w:tr>
+        <w:tc>
+          <w:tcPr>
+            <w:tcW w:type="dxa" w:w="4320"/>
+          </w:tcPr>
+          <w:p>
+            <w:r/>
+            <w:r>
+              <w:rPr>
+                <w:sz w:val="19"/>
+              </w:rPr>
+              <w:t>L2 regularization</w:t>
+            </w:r>
+          </w:p>
+        </w:tc>
+        <w:tc>
+          <w:tcPr>
+            <w:tcW w:type="dxa" w:w="4320"/>
+          </w:tcPr>
+          <w:p>
+            <w:r/>
+            <w:r>
+              <w:rPr>
+                <w:sz w:val="19"/>
+              </w:rPr>
+              <w:t>1e-2, applied to the weight matrix only (not the bias)</w:t>
+            </w:r>
+          </w:p>
+        </w:tc>
+      </w:tr>
+      <w:tr>
+        <w:tc>
+          <w:tcPr>
+            <w:tcW w:type="dxa" w:w="4320"/>
+          </w:tcPr>
+          <w:p>
+            <w:r/>
+            <w:r>
+              <w:rPr>
+                <w:sz w:val="19"/>
+              </w:rPr>
+              <w:t>Local epochs per round</w:t>
+            </w:r>
+          </w:p>
+        </w:tc>
+        <w:tc>
+          <w:tcPr>
+            <w:tcW w:type="dxa" w:w="4320"/>
+          </w:tcPr>
+          <w:p>
+            <w:r/>
+            <w:r>
+              <w:rPr>
+                <w:sz w:val="19"/>
+              </w:rPr>
+              <w:t>3 full-batch passes over each site's own data before its weights are sent back to the server</w:t>
+            </w:r>
+          </w:p>
+        </w:tc>
+      </w:tr>
+      <w:tr>
+        <w:tc>
+          <w:tcPr>
+            <w:tcW w:type="dxa" w:w="4320"/>
+          </w:tcPr>
+          <w:p>
+            <w:r/>
+            <w:r>
+              <w:rPr>
+                <w:sz w:val="19"/>
+              </w:rPr>
+              <w:t>Communication rounds</w:t>
+            </w:r>
+          </w:p>
+        </w:tc>
+        <w:tc>
+          <w:tcPr>
+            <w:tcW w:type="dxa" w:w="4320"/>
+          </w:tcPr>
+          <w:p>
+            <w:r/>
+            <w:r>
+              <w:rPr>
+                <w:sz w:val="19"/>
+              </w:rPr>
+              <w:t>200 -- chosen empirically: loss was still visibly declining at round 40, and is essentially flat (changes in the 3rd decimal place) from round ~150 on</w:t>
+            </w:r>
+          </w:p>
+        </w:tc>
+      </w:tr>
+      <w:tr>
+        <w:tc>
+          <w:tcPr>
+            <w:tcW w:type="dxa" w:w="4320"/>
+          </w:tcPr>
+          <w:p>
+            <w:r/>
+            <w:r>
+              <w:rPr>
+                <w:sz w:val="19"/>
+              </w:rPr>
+              <w:t>Cumulative local epochs</w:t>
+            </w:r>
+          </w:p>
+        </w:tc>
+        <w:tc>
+          <w:tcPr>
+            <w:tcW w:type="dxa" w:w="4320"/>
+          </w:tcPr>
+          <w:p>
+            <w:r/>
+            <w:r>
+              <w:rPr>
+                <w:sz w:val="19"/>
+              </w:rPr>
+              <w:t>600 per participating site (200 rounds x 3 local epochs)</w:t>
+            </w:r>
+          </w:p>
+        </w:tc>
+      </w:tr>
+      <w:tr>
+        <w:tc>
+          <w:tcPr>
+            <w:tcW w:type="dxa" w:w="4320"/>
+          </w:tcPr>
+          <w:p>
+            <w:r/>
+            <w:r>
+              <w:rPr>
+                <w:sz w:val="19"/>
+              </w:rPr>
+              <w:t>Aggregation rule</w:t>
+            </w:r>
+          </w:p>
+        </w:tc>
+        <w:tc>
+          <w:tcPr>
+            <w:tcW w:type="dxa" w:w="4320"/>
+          </w:tcPr>
+          <w:p>
+            <w:r/>
+            <w:r>
+              <w:rPr>
+                <w:sz w:val="19"/>
+              </w:rPr>
+              <w:t>FedAvg: server-side weighted average of the three sites' returned weight vectors, weighted by each site's patient count (n_k / total n)</w:t>
+            </w:r>
+          </w:p>
+        </w:tc>
+      </w:tr>
+      <w:tr>
+        <w:tc>
+          <w:tcPr>
+            <w:tcW w:type="dxa" w:w="4320"/>
+          </w:tcPr>
+          <w:p>
+            <w:r/>
+            <w:r>
+              <w:rPr>
+                <w:sz w:val="19"/>
+              </w:rPr>
+              <w:t>Training sites (n)</w:t>
+            </w:r>
+          </w:p>
+        </w:tc>
+        <w:tc>
+          <w:tcPr>
+            <w:tcW w:type="dxa" w:w="4320"/>
+          </w:tcPr>
+          <w:p>
+            <w:r/>
+            <w:r>
+              <w:rPr>
+                <w:sz w:val="19"/>
+              </w:rPr>
+              <w:t>Cleveland (303), Hungary (294), V.A. (200) -- 797 patients total</w:t>
+            </w:r>
+          </w:p>
+        </w:tc>
+      </w:tr>
+      <w:tr>
+        <w:tc>
+          <w:tcPr>
+            <w:tcW w:type="dxa" w:w="4320"/>
+          </w:tcPr>
+          <w:p>
+            <w:r/>
+            <w:r>
+              <w:rPr>
+                <w:sz w:val="19"/>
+              </w:rPr>
+              <w:t>Held-out site</w:t>
+            </w:r>
+          </w:p>
+        </w:tc>
+        <w:tc>
+          <w:tcPr>
+            <w:tcW w:type="dxa" w:w="4320"/>
+          </w:tcPr>
+          <w:p>
+            <w:r/>
+            <w:r>
+              <w:rPr>
+                <w:sz w:val="19"/>
+              </w:rPr>
+              <w:t>Switzerland (123) -- never included in training or averaging</w:t>
+            </w:r>
+          </w:p>
+        </w:tc>
+      </w:tr>
+      <w:tr>
+        <w:tc>
+          <w:tcPr>
+            <w:tcW w:type="dxa" w:w="4320"/>
+          </w:tcPr>
+          <w:p>
+            <w:r/>
+            <w:r>
+              <w:rPr>
+                <w:sz w:val="19"/>
+              </w:rPr>
+              <w:t>Random seed</w:t>
+            </w:r>
+          </w:p>
+        </w:tc>
+        <w:tc>
+          <w:tcPr>
+            <w:tcW w:type="dxa" w:w="4320"/>
+          </w:tcPr>
+          <w:p>
+            <w:r/>
+            <w:r>
+              <w:rPr>
+                <w:sz w:val="19"/>
+              </w:rPr>
+              <w:t>0 (fixed, for exact reproducibility)</w:t>
+            </w:r>
+          </w:p>
+        </w:tc>
+      </w:tr>
+    </w:tbl>
+    <w:p>
+      <w:pPr>
+        <w:spacing w:after="80"/>
+      </w:pPr>
     </w:p>
     <w:p>
       <w:pPr>
@@ -7177,7 +7633,7 @@
           <w:color w:val="606060"/>
           <w:sz w:val="19"/>
         </w:rPr>
-        <w:t>Figure 9.1 -- Per-site training loss across FedAvg communication rounds, 5-class disease task. All three participating sites' losses fall together, confirming the federated procedure converges. Produced by viz.plot_fed_learning_curves.</w:t>
+        <w:t>Figure 9.1 -- Per-site training loss across 600 cumulative local epochs (200 communication rounds x 3 local epochs/round), 5-class disease task, using the configuration in Table 9.1. All three participating sites' losses fall together and visibly flatten well before the end of training, confirming the federated procedure has actually converged rather than merely still improving when training was stopped. Produced by viz.plot_fed_learning_curves.</w:t>
       </w:r>
     </w:p>
     <w:p>
@@ -7190,7 +7646,7 @@
           <w:i w:val="0"/>
           <w:sz w:val="22"/>
         </w:rPr>
-        <w:t>The same convergence check, repeated on the chest-pain task, confirms FedAvg is not something that happens to work only for the disease-severity target.</w:t>
+        <w:t>The same convergence check, repeated on the chest-pain task (60 rounds x 3 local epochs = 180 cumulative epochs; otherwise identical configuration), confirms FedAvg is not something that happens to work only for the disease-severity target.</w:t>
       </w:r>
     </w:p>
     <w:p>
@@ -7280,7 +7736,7 @@
           <w:i w:val="0"/>
           <w:sz w:val="21"/>
         </w:rPr>
-        <w:t>Table 9.1 -- The 5-class disease task and the 4-class chest-pain task, head to head</w:t>
+        <w:t>Table 9.2 -- The 5-class disease task and the 4-class chest-pain task, head to head</w:t>
       </w:r>
     </w:p>
     <w:tbl>
@@ -7725,7 +8181,7 @@
           <w:color w:val="606060"/>
           <w:sz w:val="19"/>
         </w:rPr>
-        <w:t>Figure 9.3 -- The comparison from Table 9.1, plotted: heterogeneity scores, average prediction-set size, and worst-case cross-site coverage, disease task vs. chest-pain task, side by side. Produced by compare_prediction_tasks.plot_comparison.</w:t>
+        <w:t>Figure 9.3 -- The comparison from Table 9.2, plotted: heterogeneity scores, average prediction-set size, and worst-case cross-site coverage, disease task vs. chest-pain task, side by side. Produced by compare_prediction_tasks.plot_comparison.</w:t>
       </w:r>
     </w:p>
     <w:p>
@@ -7749,7 +8205,7 @@
           <w:i w:val="0"/>
           <w:sz w:val="22"/>
         </w:rPr>
-        <w:t>For completeness, the chest-pain task's own cross-site transfer matrix and set-size distribution -- the same diagnostics as Section 7, applied to a different label -- are included below rather than only summarized in Table 9.1.</w:t>
+        <w:t>For completeness, the chest-pain task's own cross-site transfer matrix and set-size distribution -- the same diagnostics as Section 7, applied to a different label -- are included below rather than only summarized in Table 9.2.</w:t>
       </w:r>
     </w:p>
     <w:p>

</xml_diff>